<commit_message>
Add 14 international committee members to IAC and TPC with authentic headshots
</commit_message>
<xml_diff>
--- a/ICNGCI_2027_Committee_Members.docx
+++ b/ICNGCI_2027_Committee_Members.docx
@@ -6288,6 +6288,654 @@
           </w:p>
         </w:tc>
       </w:tr>
+      <w:tr>
+        <w:tc>
+          <w:tcPr>
+            <w:tcW w:type="dxa" w:w="2074"/>
+          </w:tcPr>
+          <w:p>
+            <w:r>
+              <w:rPr>
+                <w:rFonts w:ascii="Arial" w:hAnsi="Arial"/>
+                <w:sz w:val="16"/>
+              </w:rPr>
+              <w:t>Prof. Shahryar Sorooshian</w:t>
+            </w:r>
+          </w:p>
+        </w:tc>
+        <w:tc>
+          <w:tcPr>
+            <w:tcW w:type="dxa" w:w="2074"/>
+          </w:tcPr>
+          <w:p>
+            <w:r>
+              <w:rPr>
+                <w:rFonts w:ascii="Arial" w:hAnsi="Arial"/>
+                <w:sz w:val="15"/>
+              </w:rPr>
+              <w:t>Professor / Senior Lecturer</w:t>
+            </w:r>
+          </w:p>
+        </w:tc>
+        <w:tc>
+          <w:tcPr>
+            <w:tcW w:type="dxa" w:w="2074"/>
+          </w:tcPr>
+          <w:p>
+            <w:r>
+              <w:rPr>
+                <w:rFonts w:ascii="Arial" w:hAnsi="Arial"/>
+                <w:sz w:val="15"/>
+              </w:rPr>
+              <w:t>Department of Business Administration</w:t>
+            </w:r>
+          </w:p>
+        </w:tc>
+        <w:tc>
+          <w:tcPr>
+            <w:tcW w:type="dxa" w:w="2074"/>
+          </w:tcPr>
+          <w:p>
+            <w:r>
+              <w:rPr>
+                <w:rFonts w:ascii="Arial" w:hAnsi="Arial"/>
+                <w:sz w:val="15"/>
+              </w:rPr>
+              <w:t>International Advisory Committee · Sweden</w:t>
+            </w:r>
+          </w:p>
+        </w:tc>
+        <w:tc>
+          <w:tcPr>
+            <w:tcW w:type="dxa" w:w="2074"/>
+          </w:tcPr>
+          <w:p>
+            <w:r>
+              <w:rPr>
+                <w:rFonts w:ascii="Arial" w:hAnsi="Arial"/>
+                <w:sz w:val="15"/>
+              </w:rPr>
+              <w:t>University of Gothenburg, Sweden</w:t>
+            </w:r>
+          </w:p>
+        </w:tc>
+      </w:tr>
+      <w:tr>
+        <w:tc>
+          <w:tcPr>
+            <w:tcW w:type="dxa" w:w="2074"/>
+          </w:tcPr>
+          <w:p>
+            <w:r>
+              <w:rPr>
+                <w:rFonts w:ascii="Arial" w:hAnsi="Arial"/>
+                <w:sz w:val="16"/>
+              </w:rPr>
+              <w:t>Dr. Murad A. Rassam</w:t>
+            </w:r>
+          </w:p>
+        </w:tc>
+        <w:tc>
+          <w:tcPr>
+            <w:tcW w:type="dxa" w:w="2074"/>
+          </w:tcPr>
+          <w:p>
+            <w:r>
+              <w:rPr>
+                <w:rFonts w:ascii="Arial" w:hAnsi="Arial"/>
+                <w:sz w:val="15"/>
+              </w:rPr>
+              <w:t>Associate Professor</w:t>
+            </w:r>
+          </w:p>
+        </w:tc>
+        <w:tc>
+          <w:tcPr>
+            <w:tcW w:type="dxa" w:w="2074"/>
+          </w:tcPr>
+          <w:p>
+            <w:r>
+              <w:rPr>
+                <w:rFonts w:ascii="Arial" w:hAnsi="Arial"/>
+                <w:sz w:val="15"/>
+              </w:rPr>
+              <w:t>Department of Information Technology</w:t>
+            </w:r>
+          </w:p>
+        </w:tc>
+        <w:tc>
+          <w:tcPr>
+            <w:tcW w:type="dxa" w:w="2074"/>
+          </w:tcPr>
+          <w:p>
+            <w:r>
+              <w:rPr>
+                <w:rFonts w:ascii="Arial" w:hAnsi="Arial"/>
+                <w:sz w:val="15"/>
+              </w:rPr>
+              <w:t>International Advisory Committee · Saudi Arabia</w:t>
+            </w:r>
+          </w:p>
+        </w:tc>
+        <w:tc>
+          <w:tcPr>
+            <w:tcW w:type="dxa" w:w="2074"/>
+          </w:tcPr>
+          <w:p>
+            <w:r>
+              <w:rPr>
+                <w:rFonts w:ascii="Arial" w:hAnsi="Arial"/>
+                <w:sz w:val="15"/>
+              </w:rPr>
+              <w:t>Qassim University, Saudi Arabia</w:t>
+            </w:r>
+          </w:p>
+        </w:tc>
+      </w:tr>
+      <w:tr>
+        <w:tc>
+          <w:tcPr>
+            <w:tcW w:type="dxa" w:w="2074"/>
+          </w:tcPr>
+          <w:p>
+            <w:r>
+              <w:rPr>
+                <w:rFonts w:ascii="Arial" w:hAnsi="Arial"/>
+                <w:sz w:val="16"/>
+              </w:rPr>
+              <w:t>Dr. Abdulsalam Ibrahim Shema</w:t>
+            </w:r>
+          </w:p>
+        </w:tc>
+        <w:tc>
+          <w:tcPr>
+            <w:tcW w:type="dxa" w:w="2074"/>
+          </w:tcPr>
+          <w:p>
+            <w:r>
+              <w:rPr>
+                <w:rFonts w:ascii="Arial" w:hAnsi="Arial"/>
+                <w:sz w:val="15"/>
+              </w:rPr>
+              <w:t>Dean, Faculty of Engineering | Chair, Department of Architecture</w:t>
+            </w:r>
+          </w:p>
+        </w:tc>
+        <w:tc>
+          <w:tcPr>
+            <w:tcW w:type="dxa" w:w="2074"/>
+          </w:tcPr>
+          <w:p>
+            <w:r>
+              <w:rPr>
+                <w:rFonts w:ascii="Arial" w:hAnsi="Arial"/>
+                <w:sz w:val="15"/>
+              </w:rPr>
+              <w:t>Faculty of Engineering</w:t>
+            </w:r>
+          </w:p>
+        </w:tc>
+        <w:tc>
+          <w:tcPr>
+            <w:tcW w:type="dxa" w:w="2074"/>
+          </w:tcPr>
+          <w:p>
+            <w:r>
+              <w:rPr>
+                <w:rFonts w:ascii="Arial" w:hAnsi="Arial"/>
+                <w:sz w:val="15"/>
+              </w:rPr>
+              <w:t>International Advisory Committee · Uganda</w:t>
+            </w:r>
+          </w:p>
+        </w:tc>
+        <w:tc>
+          <w:tcPr>
+            <w:tcW w:type="dxa" w:w="2074"/>
+          </w:tcPr>
+          <w:p>
+            <w:r>
+              <w:rPr>
+                <w:rFonts w:ascii="Arial" w:hAnsi="Arial"/>
+                <w:sz w:val="15"/>
+              </w:rPr>
+              <w:t>International University of East Africa (IUEA), Uganda</w:t>
+            </w:r>
+          </w:p>
+        </w:tc>
+      </w:tr>
+      <w:tr>
+        <w:tc>
+          <w:tcPr>
+            <w:tcW w:type="dxa" w:w="2074"/>
+          </w:tcPr>
+          <w:p>
+            <w:r>
+              <w:rPr>
+                <w:rFonts w:ascii="Arial" w:hAnsi="Arial"/>
+                <w:sz w:val="16"/>
+              </w:rPr>
+              <w:t>Prof. Hamed Al-Raweshidy</w:t>
+            </w:r>
+          </w:p>
+        </w:tc>
+        <w:tc>
+          <w:tcPr>
+            <w:tcW w:type="dxa" w:w="2074"/>
+          </w:tcPr>
+          <w:p>
+            <w:r>
+              <w:rPr>
+                <w:rFonts w:ascii="Arial" w:hAnsi="Arial"/>
+                <w:sz w:val="15"/>
+              </w:rPr>
+              <w:t>Professor &amp; Director of Postgraduate Studies (EEE)</w:t>
+            </w:r>
+          </w:p>
+        </w:tc>
+        <w:tc>
+          <w:tcPr>
+            <w:tcW w:type="dxa" w:w="2074"/>
+          </w:tcPr>
+          <w:p>
+            <w:r>
+              <w:rPr>
+                <w:rFonts w:ascii="Arial" w:hAnsi="Arial"/>
+                <w:sz w:val="15"/>
+              </w:rPr>
+              <w:t>Department of Electronic and Electrical Engineering</w:t>
+            </w:r>
+          </w:p>
+        </w:tc>
+        <w:tc>
+          <w:tcPr>
+            <w:tcW w:type="dxa" w:w="2074"/>
+          </w:tcPr>
+          <w:p>
+            <w:r>
+              <w:rPr>
+                <w:rFonts w:ascii="Arial" w:hAnsi="Arial"/>
+                <w:sz w:val="15"/>
+              </w:rPr>
+              <w:t>International Advisory Committee · United Kingdom</w:t>
+            </w:r>
+          </w:p>
+        </w:tc>
+        <w:tc>
+          <w:tcPr>
+            <w:tcW w:type="dxa" w:w="2074"/>
+          </w:tcPr>
+          <w:p>
+            <w:r>
+              <w:rPr>
+                <w:rFonts w:ascii="Arial" w:hAnsi="Arial"/>
+                <w:sz w:val="15"/>
+              </w:rPr>
+              <w:t>Brunel University London, United Kingdom</w:t>
+            </w:r>
+          </w:p>
+        </w:tc>
+      </w:tr>
+      <w:tr>
+        <w:tc>
+          <w:tcPr>
+            <w:tcW w:type="dxa" w:w="2074"/>
+          </w:tcPr>
+          <w:p>
+            <w:r>
+              <w:rPr>
+                <w:rFonts w:ascii="Arial" w:hAnsi="Arial"/>
+                <w:sz w:val="16"/>
+              </w:rPr>
+              <w:t>Prof. (Dr.) Dardan Klimenta</w:t>
+            </w:r>
+          </w:p>
+        </w:tc>
+        <w:tc>
+          <w:tcPr>
+            <w:tcW w:type="dxa" w:w="2074"/>
+          </w:tcPr>
+          <w:p>
+            <w:r>
+              <w:rPr>
+                <w:rFonts w:ascii="Arial" w:hAnsi="Arial"/>
+                <w:sz w:val="15"/>
+              </w:rPr>
+              <w:t>Full Professor</w:t>
+            </w:r>
+          </w:p>
+        </w:tc>
+        <w:tc>
+          <w:tcPr>
+            <w:tcW w:type="dxa" w:w="2074"/>
+          </w:tcPr>
+          <w:p>
+            <w:r>
+              <w:rPr>
+                <w:rFonts w:ascii="Arial" w:hAnsi="Arial"/>
+                <w:sz w:val="15"/>
+              </w:rPr>
+              <w:t>Faculty of Technical Sciences</w:t>
+            </w:r>
+          </w:p>
+        </w:tc>
+        <w:tc>
+          <w:tcPr>
+            <w:tcW w:type="dxa" w:w="2074"/>
+          </w:tcPr>
+          <w:p>
+            <w:r>
+              <w:rPr>
+                <w:rFonts w:ascii="Arial" w:hAnsi="Arial"/>
+                <w:sz w:val="15"/>
+              </w:rPr>
+              <w:t>International Advisory Committee · Serbia</w:t>
+            </w:r>
+          </w:p>
+        </w:tc>
+        <w:tc>
+          <w:tcPr>
+            <w:tcW w:type="dxa" w:w="2074"/>
+          </w:tcPr>
+          <w:p>
+            <w:r>
+              <w:rPr>
+                <w:rFonts w:ascii="Arial" w:hAnsi="Arial"/>
+                <w:sz w:val="15"/>
+              </w:rPr>
+              <w:t>University of Priština in Kosovska Mitrovica, Serbia</w:t>
+            </w:r>
+          </w:p>
+        </w:tc>
+      </w:tr>
+      <w:tr>
+        <w:tc>
+          <w:tcPr>
+            <w:tcW w:type="dxa" w:w="2074"/>
+          </w:tcPr>
+          <w:p>
+            <w:r>
+              <w:rPr>
+                <w:rFonts w:ascii="Arial" w:hAnsi="Arial"/>
+                <w:sz w:val="16"/>
+              </w:rPr>
+              <w:t>Dr. Amjad Hawash</w:t>
+            </w:r>
+          </w:p>
+        </w:tc>
+        <w:tc>
+          <w:tcPr>
+            <w:tcW w:type="dxa" w:w="2074"/>
+          </w:tcPr>
+          <w:p>
+            <w:r>
+              <w:rPr>
+                <w:rFonts w:ascii="Arial" w:hAnsi="Arial"/>
+                <w:sz w:val="15"/>
+              </w:rPr>
+              <w:t>Associate Professor &amp; AI &amp; SSE Master Programs Coordinator</w:t>
+            </w:r>
+          </w:p>
+        </w:tc>
+        <w:tc>
+          <w:tcPr>
+            <w:tcW w:type="dxa" w:w="2074"/>
+          </w:tcPr>
+          <w:p>
+            <w:r>
+              <w:rPr>
+                <w:rFonts w:ascii="Arial" w:hAnsi="Arial"/>
+                <w:sz w:val="15"/>
+              </w:rPr>
+              <w:t>Faculty of IT &amp; AI</w:t>
+            </w:r>
+          </w:p>
+        </w:tc>
+        <w:tc>
+          <w:tcPr>
+            <w:tcW w:type="dxa" w:w="2074"/>
+          </w:tcPr>
+          <w:p>
+            <w:r>
+              <w:rPr>
+                <w:rFonts w:ascii="Arial" w:hAnsi="Arial"/>
+                <w:sz w:val="15"/>
+              </w:rPr>
+              <w:t>International Advisory Committee · Palestine</w:t>
+            </w:r>
+          </w:p>
+        </w:tc>
+        <w:tc>
+          <w:tcPr>
+            <w:tcW w:type="dxa" w:w="2074"/>
+          </w:tcPr>
+          <w:p>
+            <w:r>
+              <w:rPr>
+                <w:rFonts w:ascii="Arial" w:hAnsi="Arial"/>
+                <w:sz w:val="15"/>
+              </w:rPr>
+              <w:t>An-Najah National University, Palestine</w:t>
+            </w:r>
+          </w:p>
+        </w:tc>
+      </w:tr>
+      <w:tr>
+        <w:tc>
+          <w:tcPr>
+            <w:tcW w:type="dxa" w:w="2074"/>
+          </w:tcPr>
+          <w:p>
+            <w:r>
+              <w:rPr>
+                <w:rFonts w:ascii="Arial" w:hAnsi="Arial"/>
+                <w:sz w:val="16"/>
+              </w:rPr>
+              <w:t>Prof. Jun Ma</w:t>
+            </w:r>
+          </w:p>
+        </w:tc>
+        <w:tc>
+          <w:tcPr>
+            <w:tcW w:type="dxa" w:w="2074"/>
+          </w:tcPr>
+          <w:p>
+            <w:r>
+              <w:rPr>
+                <w:rFonts w:ascii="Arial" w:hAnsi="Arial"/>
+                <w:sz w:val="15"/>
+              </w:rPr>
+              <w:t>Associate Professor</w:t>
+            </w:r>
+          </w:p>
+        </w:tc>
+        <w:tc>
+          <w:tcPr>
+            <w:tcW w:type="dxa" w:w="2074"/>
+          </w:tcPr>
+          <w:p>
+            <w:r>
+              <w:rPr>
+                <w:rFonts w:ascii="Arial" w:hAnsi="Arial"/>
+                <w:sz w:val="15"/>
+              </w:rPr>
+              <w:t>Division of Emerging Interdisciplinary Areas</w:t>
+            </w:r>
+          </w:p>
+        </w:tc>
+        <w:tc>
+          <w:tcPr>
+            <w:tcW w:type="dxa" w:w="2074"/>
+          </w:tcPr>
+          <w:p>
+            <w:r>
+              <w:rPr>
+                <w:rFonts w:ascii="Arial" w:hAnsi="Arial"/>
+                <w:sz w:val="15"/>
+              </w:rPr>
+              <w:t>International Advisory Committee · Hong Kong, China</w:t>
+            </w:r>
+          </w:p>
+        </w:tc>
+        <w:tc>
+          <w:tcPr>
+            <w:tcW w:type="dxa" w:w="2074"/>
+          </w:tcPr>
+          <w:p>
+            <w:r>
+              <w:rPr>
+                <w:rFonts w:ascii="Arial" w:hAnsi="Arial"/>
+                <w:sz w:val="15"/>
+              </w:rPr>
+              <w:t>The Hong Kong University of Science and Technology, China</w:t>
+            </w:r>
+          </w:p>
+        </w:tc>
+      </w:tr>
+      <w:tr>
+        <w:tc>
+          <w:tcPr>
+            <w:tcW w:type="dxa" w:w="2074"/>
+          </w:tcPr>
+          <w:p>
+            <w:r>
+              <w:rPr>
+                <w:rFonts w:ascii="Arial" w:hAnsi="Arial"/>
+                <w:sz w:val="16"/>
+              </w:rPr>
+              <w:t>Prof. Souhail Dhouib</w:t>
+            </w:r>
+          </w:p>
+        </w:tc>
+        <w:tc>
+          <w:tcPr>
+            <w:tcW w:type="dxa" w:w="2074"/>
+          </w:tcPr>
+          <w:p>
+            <w:r>
+              <w:rPr>
+                <w:rFonts w:ascii="Arial" w:hAnsi="Arial"/>
+                <w:sz w:val="15"/>
+              </w:rPr>
+              <w:t>Full Professor</w:t>
+            </w:r>
+          </w:p>
+        </w:tc>
+        <w:tc>
+          <w:tcPr>
+            <w:tcW w:type="dxa" w:w="2074"/>
+          </w:tcPr>
+          <w:p>
+            <w:r>
+              <w:rPr>
+                <w:rFonts w:ascii="Arial" w:hAnsi="Arial"/>
+                <w:sz w:val="15"/>
+              </w:rPr>
+              <w:t>Department of Quantitative Methods &amp; Industrial Management</w:t>
+            </w:r>
+          </w:p>
+        </w:tc>
+        <w:tc>
+          <w:tcPr>
+            <w:tcW w:type="dxa" w:w="2074"/>
+          </w:tcPr>
+          <w:p>
+            <w:r>
+              <w:rPr>
+                <w:rFonts w:ascii="Arial" w:hAnsi="Arial"/>
+                <w:sz w:val="15"/>
+              </w:rPr>
+              <w:t>International Advisory Committee · Tunisia</w:t>
+            </w:r>
+          </w:p>
+        </w:tc>
+        <w:tc>
+          <w:tcPr>
+            <w:tcW w:type="dxa" w:w="2074"/>
+          </w:tcPr>
+          <w:p>
+            <w:r>
+              <w:rPr>
+                <w:rFonts w:ascii="Arial" w:hAnsi="Arial"/>
+                <w:sz w:val="15"/>
+              </w:rPr>
+              <w:t>Higher Institute of Industrial Management, University of Sfax, Tunisia</w:t>
+            </w:r>
+          </w:p>
+        </w:tc>
+      </w:tr>
+      <w:tr>
+        <w:tc>
+          <w:tcPr>
+            <w:tcW w:type="dxa" w:w="2074"/>
+          </w:tcPr>
+          <w:p>
+            <w:r>
+              <w:rPr>
+                <w:rFonts w:ascii="Arial" w:hAnsi="Arial"/>
+                <w:sz w:val="16"/>
+              </w:rPr>
+              <w:t>Prof. Mirko Farina</w:t>
+            </w:r>
+          </w:p>
+        </w:tc>
+        <w:tc>
+          <w:tcPr>
+            <w:tcW w:type="dxa" w:w="2074"/>
+          </w:tcPr>
+          <w:p>
+            <w:r>
+              <w:rPr>
+                <w:rFonts w:ascii="Arial" w:hAnsi="Arial"/>
+                <w:sz w:val="15"/>
+              </w:rPr>
+              <w:t>Full Professor of Philosophy, Cognitive Science &amp; AI</w:t>
+            </w:r>
+          </w:p>
+        </w:tc>
+        <w:tc>
+          <w:tcPr>
+            <w:tcW w:type="dxa" w:w="2074"/>
+          </w:tcPr>
+          <w:p>
+            <w:r>
+              <w:rPr>
+                <w:rFonts w:ascii="Arial" w:hAnsi="Arial"/>
+                <w:sz w:val="15"/>
+              </w:rPr>
+              <w:t>School of Philosophy and Social Development</w:t>
+            </w:r>
+          </w:p>
+        </w:tc>
+        <w:tc>
+          <w:tcPr>
+            <w:tcW w:type="dxa" w:w="2074"/>
+          </w:tcPr>
+          <w:p>
+            <w:r>
+              <w:rPr>
+                <w:rFonts w:ascii="Arial" w:hAnsi="Arial"/>
+                <w:sz w:val="15"/>
+              </w:rPr>
+              <w:t>International Advisory Committee · China</w:t>
+            </w:r>
+          </w:p>
+        </w:tc>
+        <w:tc>
+          <w:tcPr>
+            <w:tcW w:type="dxa" w:w="2074"/>
+          </w:tcPr>
+          <w:p>
+            <w:r>
+              <w:rPr>
+                <w:rFonts w:ascii="Arial" w:hAnsi="Arial"/>
+                <w:sz w:val="15"/>
+              </w:rPr>
+              <w:t>Huaqiao University, China</w:t>
+            </w:r>
+          </w:p>
+        </w:tc>
+      </w:tr>
     </w:tbl>
     <w:p>
       <w:pPr>
@@ -18420,6 +19068,366 @@
                 <w:sz w:val="15"/>
               </w:rPr>
               <w:t>National Institute of Technology Kurukshetra, India</w:t>
+            </w:r>
+          </w:p>
+        </w:tc>
+      </w:tr>
+      <w:tr>
+        <w:tc>
+          <w:tcPr>
+            <w:tcW w:type="dxa" w:w="2074"/>
+          </w:tcPr>
+          <w:p>
+            <w:r>
+              <w:rPr>
+                <w:rFonts w:ascii="Arial" w:hAnsi="Arial"/>
+                <w:sz w:val="16"/>
+              </w:rPr>
+              <w:t>Dr. Ramahlapane Lerato (RL) Moila</w:t>
+            </w:r>
+          </w:p>
+        </w:tc>
+        <w:tc>
+          <w:tcPr>
+            <w:tcW w:type="dxa" w:w="2074"/>
+          </w:tcPr>
+          <w:p>
+            <w:r>
+              <w:rPr>
+                <w:rFonts w:ascii="Arial" w:hAnsi="Arial"/>
+                <w:sz w:val="15"/>
+              </w:rPr>
+              <w:t>Senior Lecturer</w:t>
+            </w:r>
+          </w:p>
+        </w:tc>
+        <w:tc>
+          <w:tcPr>
+            <w:tcW w:type="dxa" w:w="2074"/>
+          </w:tcPr>
+          <w:p>
+            <w:r>
+              <w:rPr>
+                <w:rFonts w:ascii="Arial" w:hAnsi="Arial"/>
+                <w:sz w:val="15"/>
+              </w:rPr>
+              <w:t>Department of Computer Science</w:t>
+            </w:r>
+          </w:p>
+        </w:tc>
+        <w:tc>
+          <w:tcPr>
+            <w:tcW w:type="dxa" w:w="2074"/>
+          </w:tcPr>
+          <w:p>
+            <w:r>
+              <w:rPr>
+                <w:rFonts w:ascii="Arial" w:hAnsi="Arial"/>
+                <w:sz w:val="15"/>
+              </w:rPr>
+              <w:t>Technical Program Committee members · South Africa</w:t>
+            </w:r>
+          </w:p>
+        </w:tc>
+        <w:tc>
+          <w:tcPr>
+            <w:tcW w:type="dxa" w:w="2074"/>
+          </w:tcPr>
+          <w:p>
+            <w:r>
+              <w:rPr>
+                <w:rFonts w:ascii="Arial" w:hAnsi="Arial"/>
+                <w:sz w:val="15"/>
+              </w:rPr>
+              <w:t>University of Limpopo, South Africa</w:t>
+            </w:r>
+          </w:p>
+        </w:tc>
+      </w:tr>
+      <w:tr>
+        <w:tc>
+          <w:tcPr>
+            <w:tcW w:type="dxa" w:w="2074"/>
+          </w:tcPr>
+          <w:p>
+            <w:r>
+              <w:rPr>
+                <w:rFonts w:ascii="Arial" w:hAnsi="Arial"/>
+                <w:sz w:val="16"/>
+              </w:rPr>
+              <w:t>Dr. Oluwatoyin Esther Akinbowale</w:t>
+            </w:r>
+          </w:p>
+        </w:tc>
+        <w:tc>
+          <w:tcPr>
+            <w:tcW w:type="dxa" w:w="2074"/>
+          </w:tcPr>
+          <w:p>
+            <w:r>
+              <w:rPr>
+                <w:rFonts w:ascii="Arial" w:hAnsi="Arial"/>
+                <w:sz w:val="15"/>
+              </w:rPr>
+              <w:t>Researcher / Postdoctoral Fellow</w:t>
+            </w:r>
+          </w:p>
+        </w:tc>
+        <w:tc>
+          <w:tcPr>
+            <w:tcW w:type="dxa" w:w="2074"/>
+          </w:tcPr>
+          <w:p>
+            <w:r>
+              <w:rPr>
+                <w:rFonts w:ascii="Arial" w:hAnsi="Arial"/>
+                <w:sz w:val="15"/>
+              </w:rPr>
+              <w:t>Department of Economics</w:t>
+            </w:r>
+          </w:p>
+        </w:tc>
+        <w:tc>
+          <w:tcPr>
+            <w:tcW w:type="dxa" w:w="2074"/>
+          </w:tcPr>
+          <w:p>
+            <w:r>
+              <w:rPr>
+                <w:rFonts w:ascii="Arial" w:hAnsi="Arial"/>
+                <w:sz w:val="15"/>
+              </w:rPr>
+              <w:t>Technical Program Committee members · South Africa</w:t>
+            </w:r>
+          </w:p>
+        </w:tc>
+        <w:tc>
+          <w:tcPr>
+            <w:tcW w:type="dxa" w:w="2074"/>
+          </w:tcPr>
+          <w:p>
+            <w:r>
+              <w:rPr>
+                <w:rFonts w:ascii="Arial" w:hAnsi="Arial"/>
+                <w:sz w:val="15"/>
+              </w:rPr>
+              <w:t>Tshwane University of Technology, Pretoria, South Africa</w:t>
+            </w:r>
+          </w:p>
+        </w:tc>
+      </w:tr>
+      <w:tr>
+        <w:tc>
+          <w:tcPr>
+            <w:tcW w:type="dxa" w:w="2074"/>
+          </w:tcPr>
+          <w:p>
+            <w:r>
+              <w:rPr>
+                <w:rFonts w:ascii="Arial" w:hAnsi="Arial"/>
+                <w:sz w:val="16"/>
+              </w:rPr>
+              <w:t>Dr. Malak Alamri</w:t>
+            </w:r>
+          </w:p>
+        </w:tc>
+        <w:tc>
+          <w:tcPr>
+            <w:tcW w:type="dxa" w:w="2074"/>
+          </w:tcPr>
+          <w:p>
+            <w:r>
+              <w:rPr>
+                <w:rFonts w:ascii="Arial" w:hAnsi="Arial"/>
+                <w:sz w:val="15"/>
+              </w:rPr>
+              <w:t>Assistant Professor in Computer Science</w:t>
+            </w:r>
+          </w:p>
+        </w:tc>
+        <w:tc>
+          <w:tcPr>
+            <w:tcW w:type="dxa" w:w="2074"/>
+          </w:tcPr>
+          <w:p>
+            <w:r>
+              <w:rPr>
+                <w:rFonts w:ascii="Arial" w:hAnsi="Arial"/>
+                <w:sz w:val="15"/>
+              </w:rPr>
+              <w:t>Computer Science and Information College</w:t>
+            </w:r>
+          </w:p>
+        </w:tc>
+        <w:tc>
+          <w:tcPr>
+            <w:tcW w:type="dxa" w:w="2074"/>
+          </w:tcPr>
+          <w:p>
+            <w:r>
+              <w:rPr>
+                <w:rFonts w:ascii="Arial" w:hAnsi="Arial"/>
+                <w:sz w:val="15"/>
+              </w:rPr>
+              <w:t>Technical Program Committee members · Saudi Arabia</w:t>
+            </w:r>
+          </w:p>
+        </w:tc>
+        <w:tc>
+          <w:tcPr>
+            <w:tcW w:type="dxa" w:w="2074"/>
+          </w:tcPr>
+          <w:p>
+            <w:r>
+              <w:rPr>
+                <w:rFonts w:ascii="Arial" w:hAnsi="Arial"/>
+                <w:sz w:val="15"/>
+              </w:rPr>
+              <w:t>Jouf University, Saudi Arabia</w:t>
+            </w:r>
+          </w:p>
+        </w:tc>
+      </w:tr>
+      <w:tr>
+        <w:tc>
+          <w:tcPr>
+            <w:tcW w:type="dxa" w:w="2074"/>
+          </w:tcPr>
+          <w:p>
+            <w:r>
+              <w:rPr>
+                <w:rFonts w:ascii="Arial" w:hAnsi="Arial"/>
+                <w:sz w:val="16"/>
+              </w:rPr>
+              <w:t>Ihnsik Weon</w:t>
+            </w:r>
+          </w:p>
+        </w:tc>
+        <w:tc>
+          <w:tcPr>
+            <w:tcW w:type="dxa" w:w="2074"/>
+          </w:tcPr>
+          <w:p>
+            <w:r>
+              <w:rPr>
+                <w:rFonts w:ascii="Arial" w:hAnsi="Arial"/>
+                <w:sz w:val="15"/>
+              </w:rPr>
+              <w:t>Senior Researcher</w:t>
+            </w:r>
+          </w:p>
+        </w:tc>
+        <w:tc>
+          <w:tcPr>
+            <w:tcW w:type="dxa" w:w="2074"/>
+          </w:tcPr>
+          <w:p>
+            <w:r>
+              <w:rPr>
+                <w:rFonts w:ascii="Arial" w:hAnsi="Arial"/>
+                <w:sz w:val="15"/>
+              </w:rPr>
+              <w:t>Intelligence Root Technology Research Group</w:t>
+            </w:r>
+          </w:p>
+        </w:tc>
+        <w:tc>
+          <w:tcPr>
+            <w:tcW w:type="dxa" w:w="2074"/>
+          </w:tcPr>
+          <w:p>
+            <w:r>
+              <w:rPr>
+                <w:rFonts w:ascii="Arial" w:hAnsi="Arial"/>
+                <w:sz w:val="15"/>
+              </w:rPr>
+              <w:t>Technical Program Committee members · South Korea</w:t>
+            </w:r>
+          </w:p>
+        </w:tc>
+        <w:tc>
+          <w:tcPr>
+            <w:tcW w:type="dxa" w:w="2074"/>
+          </w:tcPr>
+          <w:p>
+            <w:r>
+              <w:rPr>
+                <w:rFonts w:ascii="Arial" w:hAnsi="Arial"/>
+                <w:sz w:val="15"/>
+              </w:rPr>
+              <w:t>Korea Institute of Industrial Technology (KITECH), South Korea</w:t>
+            </w:r>
+          </w:p>
+        </w:tc>
+      </w:tr>
+      <w:tr>
+        <w:tc>
+          <w:tcPr>
+            <w:tcW w:type="dxa" w:w="2074"/>
+          </w:tcPr>
+          <w:p>
+            <w:r>
+              <w:rPr>
+                <w:rFonts w:ascii="Arial" w:hAnsi="Arial"/>
+                <w:sz w:val="16"/>
+              </w:rPr>
+              <w:t>Dr. Giuseppe Tricomi</w:t>
+            </w:r>
+          </w:p>
+        </w:tc>
+        <w:tc>
+          <w:tcPr>
+            <w:tcW w:type="dxa" w:w="2074"/>
+          </w:tcPr>
+          <w:p>
+            <w:r>
+              <w:rPr>
+                <w:rFonts w:ascii="Arial" w:hAnsi="Arial"/>
+                <w:sz w:val="15"/>
+              </w:rPr>
+              <w:t>Assistant Professor (RTD)</w:t>
+            </w:r>
+          </w:p>
+        </w:tc>
+        <w:tc>
+          <w:tcPr>
+            <w:tcW w:type="dxa" w:w="2074"/>
+          </w:tcPr>
+          <w:p>
+            <w:r>
+              <w:rPr>
+                <w:rFonts w:ascii="Arial" w:hAnsi="Arial"/>
+                <w:sz w:val="15"/>
+              </w:rPr>
+              <w:t>Department of Engineering</w:t>
+            </w:r>
+          </w:p>
+        </w:tc>
+        <w:tc>
+          <w:tcPr>
+            <w:tcW w:type="dxa" w:w="2074"/>
+          </w:tcPr>
+          <w:p>
+            <w:r>
+              <w:rPr>
+                <w:rFonts w:ascii="Arial" w:hAnsi="Arial"/>
+                <w:sz w:val="15"/>
+              </w:rPr>
+              <w:t>Technical Program Committee members · Italy</w:t>
+            </w:r>
+          </w:p>
+        </w:tc>
+        <w:tc>
+          <w:tcPr>
+            <w:tcW w:type="dxa" w:w="2074"/>
+          </w:tcPr>
+          <w:p>
+            <w:r>
+              <w:rPr>
+                <w:rFonts w:ascii="Arial" w:hAnsi="Arial"/>
+                <w:sz w:val="15"/>
+              </w:rPr>
+              <w:t>Università degli Studi di Messina, Italy</w:t>
             </w:r>
           </w:p>
         </w:tc>

</xml_diff>